<commit_message>
chore: 同步 webui.html, 详细测试报告_20261026.md, 详细测试报告_20261026.docx
</commit_message>
<xml_diff>
--- a/详细测试报告_20261026.docx
+++ b/详细测试报告_20261026.docx
@@ -168,7 +168,7 @@
           <w:b/>
           <w:sz w:val="21"/>
         </w:rPr>
-        <w:t>四轮共发现 27 个问题，全部修复并加了回归用例。</w:t>
+        <w:t>五轮共发现 29 个问题，全部修复并加了回归用例。</w:t>
       </w:r>
     </w:p>
     <w:p>
@@ -914,6 +914,44 @@
                 <w:sz w:val="19"/>
               </w:rPr>
               <w:t xml:space="preserve"> / 空格 / 中文的路径全部可用</w:t>
+            </w:r>
+          </w:p>
+        </w:tc>
+      </w:tr>
+      <w:tr>
+        <w:tc>
+          <w:tcPr>
+            <w:tcW w:type="dxa" w:w="4320"/>
+          </w:tcPr>
+          <w:p>
+            <w:pPr>
+              <w:spacing w:after="20"/>
+            </w:pPr>
+            <w:r>
+              <w:rPr>
+                <w:rFonts w:ascii="微软雅黑" w:hAnsi="微软雅黑" w:eastAsia="微软雅黑"/>
+                <w:b w:val="0"/>
+                <w:sz w:val="19"/>
+              </w:rPr>
+              <w:t>网页交互</w:t>
+            </w:r>
+          </w:p>
+        </w:tc>
+        <w:tc>
+          <w:tcPr>
+            <w:tcW w:type="dxa" w:w="4320"/>
+          </w:tcPr>
+          <w:p>
+            <w:pPr>
+              <w:spacing w:after="20"/>
+            </w:pPr>
+            <w:r>
+              <w:rPr>
+                <w:rFonts w:ascii="微软雅黑" w:hAnsi="微软雅黑" w:eastAsia="微软雅黑"/>
+                <w:b w:val="0"/>
+                <w:sz w:val="19"/>
+              </w:rPr>
+              <w:t>10 个面板切换、复制、导出、历史回填、十六进制、双图、清理，控制台 0 错误</w:t>
             </w:r>
           </w:p>
         </w:tc>
@@ -4112,6 +4150,364 @@
           <w:color w:val="1F3A5F"/>
           <w:sz w:val="25"/>
         </w:rPr>
+        <w:t>2.8 第五轮：网页界面真实交互（Playwright 真点）</w:t>
+      </w:r>
+    </w:p>
+    <w:p/>
+    <w:tbl>
+      <w:tblPr>
+        <w:tblStyle w:val="TableGrid"/>
+        <w:tblW w:type="auto" w:w="0"/>
+        <w:jc w:val="center"/>
+        <w:tblLook w:firstColumn="1" w:firstRow="1" w:lastColumn="0" w:lastRow="0" w:noHBand="0" w:noVBand="1" w:val="04A0"/>
+      </w:tblPr>
+      <w:tblGrid>
+        <w:gridCol w:w="4320"/>
+        <w:gridCol w:w="4320"/>
+      </w:tblGrid>
+      <w:tr>
+        <w:tc>
+          <w:tcPr>
+            <w:tcW w:type="dxa" w:w="4320"/>
+          </w:tcPr>
+          <w:p>
+            <w:pPr>
+              <w:spacing w:after="20"/>
+            </w:pPr>
+            <w:r>
+              <w:rPr>
+                <w:rFonts w:ascii="微软雅黑" w:hAnsi="微软雅黑" w:eastAsia="微软雅黑"/>
+                <w:b/>
+                <w:sz w:val="19"/>
+              </w:rPr>
+              <w:t>交互</w:t>
+            </w:r>
+          </w:p>
+        </w:tc>
+        <w:tc>
+          <w:tcPr>
+            <w:tcW w:type="dxa" w:w="4320"/>
+          </w:tcPr>
+          <w:p>
+            <w:pPr>
+              <w:spacing w:after="20"/>
+            </w:pPr>
+            <w:r>
+              <w:rPr>
+                <w:rFonts w:ascii="微软雅黑" w:hAnsi="微软雅黑" w:eastAsia="微软雅黑"/>
+                <w:b/>
+                <w:sz w:val="19"/>
+              </w:rPr>
+              <w:t>结果</w:t>
+            </w:r>
+          </w:p>
+        </w:tc>
+      </w:tr>
+      <w:tr>
+        <w:tc>
+          <w:tcPr>
+            <w:tcW w:type="dxa" w:w="4320"/>
+          </w:tcPr>
+          <w:p>
+            <w:pPr>
+              <w:spacing w:after="20"/>
+            </w:pPr>
+            <w:r>
+              <w:rPr>
+                <w:rFonts w:ascii="微软雅黑" w:hAnsi="微软雅黑" w:eastAsia="微软雅黑"/>
+                <w:b w:val="0"/>
+                <w:sz w:val="19"/>
+              </w:rPr>
+              <w:t>10 个面板逐个切换</w:t>
+            </w:r>
+          </w:p>
+        </w:tc>
+        <w:tc>
+          <w:tcPr>
+            <w:tcW w:type="dxa" w:w="4320"/>
+          </w:tcPr>
+          <w:p>
+            <w:pPr>
+              <w:spacing w:after="20"/>
+            </w:pPr>
+            <w:r>
+              <w:rPr>
+                <w:rFonts w:ascii="微软雅黑" w:hAnsi="微软雅黑" w:eastAsia="微软雅黑"/>
+                <w:b w:val="0"/>
+                <w:sz w:val="19"/>
+              </w:rPr>
+              <w:t>全部正常，提示文字跟着变，控制台 0 错误</w:t>
+            </w:r>
+          </w:p>
+        </w:tc>
+      </w:tr>
+      <w:tr>
+        <w:tc>
+          <w:tcPr>
+            <w:tcW w:type="dxa" w:w="4320"/>
+          </w:tcPr>
+          <w:p>
+            <w:pPr>
+              <w:spacing w:after="20"/>
+            </w:pPr>
+            <w:r>
+              <w:rPr>
+                <w:rFonts w:ascii="微软雅黑" w:hAnsi="微软雅黑" w:eastAsia="微软雅黑"/>
+                <w:b w:val="0"/>
+                <w:sz w:val="19"/>
+              </w:rPr>
+              <w:t>「复制」按钮</w:t>
+            </w:r>
+          </w:p>
+        </w:tc>
+        <w:tc>
+          <w:tcPr>
+            <w:tcW w:type="dxa" w:w="4320"/>
+          </w:tcPr>
+          <w:p>
+            <w:pPr>
+              <w:spacing w:after="20"/>
+            </w:pPr>
+            <w:r>
+              <w:rPr>
+                <w:rFonts w:ascii="微软雅黑" w:hAnsi="微软雅黑" w:eastAsia="微软雅黑"/>
+                <w:b w:val="0"/>
+                <w:sz w:val="19"/>
+              </w:rPr>
+              <w:t>点击后变「已复制」，剪贴板拿到 flag</w:t>
+            </w:r>
+          </w:p>
+        </w:tc>
+      </w:tr>
+      <w:tr>
+        <w:tc>
+          <w:tcPr>
+            <w:tcW w:type="dxa" w:w="4320"/>
+          </w:tcPr>
+          <w:p>
+            <w:pPr>
+              <w:spacing w:after="20"/>
+            </w:pPr>
+            <w:r>
+              <w:rPr>
+                <w:rFonts w:ascii="微软雅黑" w:hAnsi="微软雅黑" w:eastAsia="微软雅黑"/>
+                <w:b w:val="0"/>
+                <w:sz w:val="19"/>
+              </w:rPr>
+              <w:t>「导出 .md」</w:t>
+            </w:r>
+          </w:p>
+        </w:tc>
+        <w:tc>
+          <w:tcPr>
+            <w:tcW w:type="dxa" w:w="4320"/>
+          </w:tcPr>
+          <w:p>
+            <w:pPr>
+              <w:spacing w:after="20"/>
+            </w:pPr>
+            <w:r>
+              <w:rPr>
+                <w:rFonts w:ascii="微软雅黑" w:hAnsi="微软雅黑" w:eastAsia="微软雅黑"/>
+                <w:b w:val="0"/>
+                <w:sz w:val="19"/>
+              </w:rPr>
+              <w:t xml:space="preserve">分析后按钮应可见 —— </w:t>
+            </w:r>
+            <w:r>
+              <w:rPr>
+                <w:rFonts w:ascii="微软雅黑" w:hAnsi="微软雅黑" w:eastAsia="微软雅黑"/>
+                <w:b/>
+                <w:sz w:val="19"/>
+              </w:rPr>
+              <w:t>原来一直是隐藏的</w:t>
+            </w:r>
+            <w:r>
+              <w:rPr>
+                <w:rFonts w:ascii="微软雅黑" w:hAnsi="微软雅黑" w:eastAsia="微软雅黑"/>
+                <w:b w:val="0"/>
+                <w:sz w:val="19"/>
+              </w:rPr>
+              <w:t xml:space="preserve">（见 3.7），修复后点击能下载 </w:t>
+            </w:r>
+            <w:r>
+              <w:rPr>
+                <w:rFonts w:ascii="Consolas" w:hAnsi="Consolas" w:eastAsia="Consolas"/>
+                <w:b w:val="0"/>
+                <w:color w:val="C7254E"/>
+                <w:sz w:val="17"/>
+              </w:rPr>
+              <w:t>CTF报告_日期.md</w:t>
+            </w:r>
+          </w:p>
+        </w:tc>
+      </w:tr>
+      <w:tr>
+        <w:tc>
+          <w:tcPr>
+            <w:tcW w:type="dxa" w:w="4320"/>
+          </w:tcPr>
+          <w:p>
+            <w:pPr>
+              <w:spacing w:after="20"/>
+            </w:pPr>
+            <w:r>
+              <w:rPr>
+                <w:rFonts w:ascii="微软雅黑" w:hAnsi="微软雅黑" w:eastAsia="微软雅黑"/>
+                <w:b w:val="0"/>
+                <w:sz w:val="19"/>
+              </w:rPr>
+              <w:t>历史记录点击</w:t>
+            </w:r>
+          </w:p>
+        </w:tc>
+        <w:tc>
+          <w:tcPr>
+            <w:tcW w:type="dxa" w:w="4320"/>
+          </w:tcPr>
+          <w:p>
+            <w:pPr>
+              <w:spacing w:after="20"/>
+            </w:pPr>
+            <w:r>
+              <w:rPr>
+                <w:rFonts w:ascii="微软雅黑" w:hAnsi="微软雅黑" w:eastAsia="微软雅黑"/>
+                <w:b w:val="0"/>
+                <w:sz w:val="19"/>
+              </w:rPr>
+              <w:t>8 条记录，点第一条能回填输入框并重新分析</w:t>
+            </w:r>
+          </w:p>
+        </w:tc>
+      </w:tr>
+      <w:tr>
+        <w:tc>
+          <w:tcPr>
+            <w:tcW w:type="dxa" w:w="4320"/>
+          </w:tcPr>
+          <w:p>
+            <w:pPr>
+              <w:spacing w:after="20"/>
+            </w:pPr>
+            <w:r>
+              <w:rPr>
+                <w:rFonts w:ascii="微软雅黑" w:hAnsi="微软雅黑" w:eastAsia="微软雅黑"/>
+                <w:b w:val="0"/>
+                <w:sz w:val="19"/>
+              </w:rPr>
+              <w:t>十六进制面板</w:t>
+            </w:r>
+          </w:p>
+        </w:tc>
+        <w:tc>
+          <w:tcPr>
+            <w:tcW w:type="dxa" w:w="4320"/>
+          </w:tcPr>
+          <w:p>
+            <w:pPr>
+              <w:spacing w:after="20"/>
+            </w:pPr>
+            <w:r>
+              <w:rPr>
+                <w:rFonts w:ascii="微软雅黑" w:hAnsi="微软雅黑" w:eastAsia="微软雅黑"/>
+                <w:b w:val="0"/>
+                <w:sz w:val="19"/>
+              </w:rPr>
+              <w:t>显示文件大小、偏移、总行数、hexdump，翻屏/跳转控件都在</w:t>
+            </w:r>
+          </w:p>
+        </w:tc>
+      </w:tr>
+      <w:tr>
+        <w:tc>
+          <w:tcPr>
+            <w:tcW w:type="dxa" w:w="4320"/>
+          </w:tcPr>
+          <w:p>
+            <w:pPr>
+              <w:spacing w:after="20"/>
+            </w:pPr>
+            <w:r>
+              <w:rPr>
+                <w:rFonts w:ascii="微软雅黑" w:hAnsi="微软雅黑" w:eastAsia="微软雅黑"/>
+                <w:b w:val="0"/>
+                <w:sz w:val="19"/>
+              </w:rPr>
+              <w:t>双图对比</w:t>
+            </w:r>
+          </w:p>
+        </w:tc>
+        <w:tc>
+          <w:tcPr>
+            <w:tcW w:type="dxa" w:w="4320"/>
+          </w:tcPr>
+          <w:p>
+            <w:pPr>
+              <w:spacing w:after="20"/>
+            </w:pPr>
+            <w:r>
+              <w:rPr>
+                <w:rFonts w:ascii="微软雅黑" w:hAnsi="微软雅黑" w:eastAsia="微软雅黑"/>
+                <w:b w:val="0"/>
+                <w:sz w:val="19"/>
+              </w:rPr>
+              <w:t>传两张图 → 异或/差值/相加 共 5 张预览正常渲染</w:t>
+            </w:r>
+          </w:p>
+        </w:tc>
+      </w:tr>
+      <w:tr>
+        <w:tc>
+          <w:tcPr>
+            <w:tcW w:type="dxa" w:w="4320"/>
+          </w:tcPr>
+          <w:p>
+            <w:pPr>
+              <w:spacing w:after="20"/>
+            </w:pPr>
+            <w:r>
+              <w:rPr>
+                <w:rFonts w:ascii="微软雅黑" w:hAnsi="微软雅黑" w:eastAsia="微软雅黑"/>
+                <w:b w:val="0"/>
+                <w:sz w:val="19"/>
+              </w:rPr>
+              <w:t>「清临时文件」</w:t>
+            </w:r>
+          </w:p>
+        </w:tc>
+        <w:tc>
+          <w:tcPr>
+            <w:tcW w:type="dxa" w:w="4320"/>
+          </w:tcPr>
+          <w:p>
+            <w:pPr>
+              <w:spacing w:after="20"/>
+            </w:pPr>
+            <w:r>
+              <w:rPr>
+                <w:rFonts w:ascii="微软雅黑" w:hAnsi="微软雅黑" w:eastAsia="微软雅黑"/>
+                <w:b w:val="0"/>
+                <w:sz w:val="19"/>
+              </w:rPr>
+              <w:t>第一次点变「再点一次确认」，第二次真清并提示「已清理 1 项」</w:t>
+            </w:r>
+          </w:p>
+        </w:tc>
+      </w:tr>
+    </w:tbl>
+    <w:p/>
+    <w:p/>
+    <w:p>
+      <w:pPr>
+        <w:pStyle w:val="Heading3"/>
+      </w:pPr>
+      <w:r>
+        <w:rPr>
+          <w:rFonts w:ascii="微软雅黑" w:hAnsi="微软雅黑" w:eastAsia="微软雅黑"/>
+          <w:b w:val="0"/>
+          <w:color w:val="1F3A5F"/>
+          <w:sz w:val="25"/>
+        </w:rPr>
         <w:t>2.5 手工边界样本</w:t>
       </w:r>
     </w:p>
@@ -8473,6 +8869,400 @@
                 <w:sz w:val="19"/>
               </w:rPr>
               <w:t xml:space="preserve"> / 空格 / 中文的路径复测通过</w:t>
+            </w:r>
+          </w:p>
+        </w:tc>
+      </w:tr>
+    </w:tbl>
+    <w:p/>
+    <w:p/>
+    <w:p>
+      <w:pPr>
+        <w:pStyle w:val="Heading3"/>
+      </w:pPr>
+      <w:r>
+        <w:rPr>
+          <w:rFonts w:ascii="微软雅黑" w:hAnsi="微软雅黑" w:eastAsia="微软雅黑"/>
+          <w:b w:val="0"/>
+          <w:color w:val="1F3A5F"/>
+          <w:sz w:val="25"/>
+        </w:rPr>
+        <w:t>3.7 第五轮发现（28–29）</w:t>
+      </w:r>
+    </w:p>
+    <w:p/>
+    <w:tbl>
+      <w:tblPr>
+        <w:tblStyle w:val="TableGrid"/>
+        <w:tblW w:type="auto" w:w="0"/>
+        <w:jc w:val="center"/>
+        <w:tblLook w:firstColumn="1" w:firstRow="1" w:lastColumn="0" w:lastRow="0" w:noHBand="0" w:noVBand="1" w:val="04A0"/>
+      </w:tblPr>
+      <w:tblGrid>
+        <w:gridCol w:w="1728"/>
+        <w:gridCol w:w="1728"/>
+        <w:gridCol w:w="1728"/>
+        <w:gridCol w:w="1728"/>
+        <w:gridCol w:w="1728"/>
+      </w:tblGrid>
+      <w:tr>
+        <w:tc>
+          <w:tcPr>
+            <w:tcW w:type="dxa" w:w="1728"/>
+          </w:tcPr>
+          <w:p>
+            <w:pPr>
+              <w:spacing w:after="20"/>
+            </w:pPr>
+            <w:r>
+              <w:rPr>
+                <w:rFonts w:ascii="微软雅黑" w:hAnsi="微软雅黑" w:eastAsia="微软雅黑"/>
+                <w:b/>
+                <w:sz w:val="19"/>
+              </w:rPr>
+              <w:t>#</w:t>
+            </w:r>
+          </w:p>
+        </w:tc>
+        <w:tc>
+          <w:tcPr>
+            <w:tcW w:type="dxa" w:w="1728"/>
+          </w:tcPr>
+          <w:p>
+            <w:pPr>
+              <w:spacing w:after="20"/>
+            </w:pPr>
+            <w:r>
+              <w:rPr>
+                <w:rFonts w:ascii="微软雅黑" w:hAnsi="微软雅黑" w:eastAsia="微软雅黑"/>
+                <w:b/>
+                <w:sz w:val="19"/>
+              </w:rPr>
+              <w:t>问题</w:t>
+            </w:r>
+          </w:p>
+        </w:tc>
+        <w:tc>
+          <w:tcPr>
+            <w:tcW w:type="dxa" w:w="1728"/>
+          </w:tcPr>
+          <w:p>
+            <w:pPr>
+              <w:spacing w:after="20"/>
+            </w:pPr>
+            <w:r>
+              <w:rPr>
+                <w:rFonts w:ascii="微软雅黑" w:hAnsi="微软雅黑" w:eastAsia="微软雅黑"/>
+                <w:b/>
+                <w:sz w:val="19"/>
+              </w:rPr>
+              <w:t>现象</w:t>
+            </w:r>
+          </w:p>
+        </w:tc>
+        <w:tc>
+          <w:tcPr>
+            <w:tcW w:type="dxa" w:w="1728"/>
+          </w:tcPr>
+          <w:p>
+            <w:pPr>
+              <w:spacing w:after="20"/>
+            </w:pPr>
+            <w:r>
+              <w:rPr>
+                <w:rFonts w:ascii="微软雅黑" w:hAnsi="微软雅黑" w:eastAsia="微软雅黑"/>
+                <w:b/>
+                <w:sz w:val="19"/>
+              </w:rPr>
+              <w:t>根因</w:t>
+            </w:r>
+          </w:p>
+        </w:tc>
+        <w:tc>
+          <w:tcPr>
+            <w:tcW w:type="dxa" w:w="1728"/>
+          </w:tcPr>
+          <w:p>
+            <w:pPr>
+              <w:spacing w:after="20"/>
+            </w:pPr>
+            <w:r>
+              <w:rPr>
+                <w:rFonts w:ascii="微软雅黑" w:hAnsi="微软雅黑" w:eastAsia="微软雅黑"/>
+                <w:b/>
+                <w:sz w:val="19"/>
+              </w:rPr>
+              <w:t>修复</w:t>
+            </w:r>
+          </w:p>
+        </w:tc>
+      </w:tr>
+      <w:tr>
+        <w:tc>
+          <w:tcPr>
+            <w:tcW w:type="dxa" w:w="1728"/>
+          </w:tcPr>
+          <w:p>
+            <w:pPr>
+              <w:spacing w:after="20"/>
+            </w:pPr>
+            <w:r>
+              <w:rPr>
+                <w:rFonts w:ascii="微软雅黑" w:hAnsi="微软雅黑" w:eastAsia="微软雅黑"/>
+                <w:b w:val="0"/>
+                <w:sz w:val="19"/>
+              </w:rPr>
+              <w:t>28</w:t>
+            </w:r>
+          </w:p>
+        </w:tc>
+        <w:tc>
+          <w:tcPr>
+            <w:tcW w:type="dxa" w:w="1728"/>
+          </w:tcPr>
+          <w:p>
+            <w:pPr>
+              <w:spacing w:after="20"/>
+            </w:pPr>
+            <w:r>
+              <w:rPr>
+                <w:rFonts w:ascii="微软雅黑" w:hAnsi="微软雅黑" w:eastAsia="微软雅黑"/>
+                <w:b/>
+                <w:sz w:val="19"/>
+              </w:rPr>
+              <w:t>「导出 .md」按钮不显示</w:t>
+            </w:r>
+          </w:p>
+        </w:tc>
+        <w:tc>
+          <w:tcPr>
+            <w:tcW w:type="dxa" w:w="1728"/>
+          </w:tcPr>
+          <w:p>
+            <w:pPr>
+              <w:spacing w:after="20"/>
+            </w:pPr>
+            <w:r>
+              <w:rPr>
+                <w:rFonts w:ascii="微软雅黑" w:hAnsi="微软雅黑" w:eastAsia="微软雅黑"/>
+                <w:b w:val="0"/>
+                <w:sz w:val="19"/>
+              </w:rPr>
+              <w:t>分析完，结果卡片旁边没有「导出 .md」按钮，用户没法导出报告</w:t>
+            </w:r>
+          </w:p>
+        </w:tc>
+        <w:tc>
+          <w:tcPr>
+            <w:tcW w:type="dxa" w:w="1728"/>
+          </w:tcPr>
+          <w:p>
+            <w:pPr>
+              <w:spacing w:after="20"/>
+            </w:pPr>
+            <w:r>
+              <w:rPr>
+                <w:rFonts w:ascii="微软雅黑" w:hAnsi="微软雅黑" w:eastAsia="微软雅黑"/>
+                <w:b w:val="0"/>
+                <w:sz w:val="19"/>
+              </w:rPr>
+              <w:t xml:space="preserve">显示按钮的代码只写在「搜索结果」的 </w:t>
+            </w:r>
+            <w:r>
+              <w:rPr>
+                <w:rFonts w:ascii="Consolas" w:hAnsi="Consolas" w:eastAsia="Consolas"/>
+                <w:b w:val="0"/>
+                <w:color w:val="C7254E"/>
+                <w:sz w:val="17"/>
+              </w:rPr>
+              <w:t>renderSearch()</w:t>
+            </w:r>
+            <w:r>
+              <w:rPr>
+                <w:rFonts w:ascii="微软雅黑" w:hAnsi="微软雅黑" w:eastAsia="微软雅黑"/>
+                <w:b w:val="0"/>
+                <w:sz w:val="19"/>
+              </w:rPr>
+              <w:t xml:space="preserve"> 里，正常分析的 </w:t>
+            </w:r>
+            <w:r>
+              <w:rPr>
+                <w:rFonts w:ascii="Consolas" w:hAnsi="Consolas" w:eastAsia="Consolas"/>
+                <w:b w:val="0"/>
+                <w:color w:val="C7254E"/>
+                <w:sz w:val="17"/>
+              </w:rPr>
+              <w:t>render()</w:t>
+            </w:r>
+            <w:r>
+              <w:rPr>
+                <w:rFonts w:ascii="微软雅黑" w:hAnsi="微软雅黑" w:eastAsia="微软雅黑"/>
+                <w:b w:val="0"/>
+                <w:sz w:val="19"/>
+              </w:rPr>
+              <w:t xml:space="preserve"> 漏了</w:t>
+            </w:r>
+          </w:p>
+        </w:tc>
+        <w:tc>
+          <w:tcPr>
+            <w:tcW w:type="dxa" w:w="1728"/>
+          </w:tcPr>
+          <w:p>
+            <w:pPr>
+              <w:spacing w:after="20"/>
+            </w:pPr>
+            <w:r>
+              <w:rPr>
+                <w:rFonts w:ascii="微软雅黑" w:hAnsi="微软雅黑" w:eastAsia="微软雅黑"/>
+                <w:b w:val="0"/>
+                <w:sz w:val="19"/>
+              </w:rPr>
+              <w:t xml:space="preserve">在 </w:t>
+            </w:r>
+            <w:r>
+              <w:rPr>
+                <w:rFonts w:ascii="Consolas" w:hAnsi="Consolas" w:eastAsia="Consolas"/>
+                <w:b w:val="0"/>
+                <w:color w:val="C7254E"/>
+                <w:sz w:val="17"/>
+              </w:rPr>
+              <w:t>render()</w:t>
+            </w:r>
+            <w:r>
+              <w:rPr>
+                <w:rFonts w:ascii="微软雅黑" w:hAnsi="微软雅黑" w:eastAsia="微软雅黑"/>
+                <w:b w:val="0"/>
+                <w:sz w:val="19"/>
+              </w:rPr>
+              <w:t xml:space="preserve"> 末尾补上 </w:t>
+            </w:r>
+            <w:r>
+              <w:rPr>
+                <w:rFonts w:ascii="Consolas" w:hAnsi="Consolas" w:eastAsia="Consolas"/>
+                <w:b w:val="0"/>
+                <w:color w:val="C7254E"/>
+                <w:sz w:val="17"/>
+              </w:rPr>
+              <w:t>#expmd</w:t>
+            </w:r>
+            <w:r>
+              <w:rPr>
+                <w:rFonts w:ascii="微软雅黑" w:hAnsi="微软雅黑" w:eastAsia="微软雅黑"/>
+                <w:b w:val="0"/>
+                <w:sz w:val="19"/>
+              </w:rPr>
+              <w:t xml:space="preserve"> 显示；实测点击能下载 </w:t>
+            </w:r>
+            <w:r>
+              <w:rPr>
+                <w:rFonts w:ascii="Consolas" w:hAnsi="Consolas" w:eastAsia="Consolas"/>
+                <w:b w:val="0"/>
+                <w:color w:val="C7254E"/>
+                <w:sz w:val="17"/>
+              </w:rPr>
+              <w:t>CTF报告_2026-10-26….md</w:t>
+            </w:r>
+          </w:p>
+        </w:tc>
+      </w:tr>
+      <w:tr>
+        <w:tc>
+          <w:tcPr>
+            <w:tcW w:type="dxa" w:w="1728"/>
+          </w:tcPr>
+          <w:p>
+            <w:pPr>
+              <w:spacing w:after="20"/>
+            </w:pPr>
+            <w:r>
+              <w:rPr>
+                <w:rFonts w:ascii="微软雅黑" w:hAnsi="微软雅黑" w:eastAsia="微软雅黑"/>
+                <w:b w:val="0"/>
+                <w:sz w:val="19"/>
+              </w:rPr>
+              <w:t>29</w:t>
+            </w:r>
+          </w:p>
+        </w:tc>
+        <w:tc>
+          <w:tcPr>
+            <w:tcW w:type="dxa" w:w="1728"/>
+          </w:tcPr>
+          <w:p>
+            <w:pPr>
+              <w:spacing w:after="20"/>
+            </w:pPr>
+            <w:r>
+              <w:rPr>
+                <w:rFonts w:ascii="微软雅黑" w:hAnsi="微软雅黑" w:eastAsia="微软雅黑"/>
+                <w:b/>
+                <w:sz w:val="19"/>
+              </w:rPr>
+              <w:t>面板编号乱序</w:t>
+            </w:r>
+          </w:p>
+        </w:tc>
+        <w:tc>
+          <w:tcPr>
+            <w:tcW w:type="dxa" w:w="1728"/>
+          </w:tcPr>
+          <w:p>
+            <w:pPr>
+              <w:spacing w:after="20"/>
+            </w:pPr>
+            <w:r>
+              <w:rPr>
+                <w:rFonts w:ascii="微软雅黑" w:hAnsi="微软雅黑" w:eastAsia="微软雅黑"/>
+                <w:b w:val="0"/>
+                <w:sz w:val="19"/>
+              </w:rPr>
+              <w:t>标签栏是 ④ Web → ⑧ 渗透扫描 → ⑤ 取证 → ⑥ Pwn → ⑦ RSA → ⑩ 十六进制，跳号且缺 ⑨</w:t>
+            </w:r>
+          </w:p>
+        </w:tc>
+        <w:tc>
+          <w:tcPr>
+            <w:tcW w:type="dxa" w:w="1728"/>
+          </w:tcPr>
+          <w:p>
+            <w:pPr>
+              <w:spacing w:after="20"/>
+            </w:pPr>
+            <w:r>
+              <w:rPr>
+                <w:rFonts w:ascii="Consolas" w:hAnsi="Consolas" w:eastAsia="Consolas"/>
+                <w:b w:val="0"/>
+                <w:color w:val="C7254E"/>
+                <w:sz w:val="17"/>
+              </w:rPr>
+              <w:t>PANELS</w:t>
+            </w:r>
+            <w:r>
+              <w:rPr>
+                <w:rFonts w:ascii="微软雅黑" w:hAnsi="微软雅黑" w:eastAsia="微软雅黑"/>
+                <w:b w:val="0"/>
+                <w:sz w:val="19"/>
+              </w:rPr>
+              <w:t xml:space="preserve"> 数组里 webscan 是后加的，直接插在 web 后面，没按编号排序</w:t>
+            </w:r>
+          </w:p>
+        </w:tc>
+        <w:tc>
+          <w:tcPr>
+            <w:tcW w:type="dxa" w:w="1728"/>
+          </w:tcPr>
+          <w:p>
+            <w:pPr>
+              <w:spacing w:after="20"/>
+            </w:pPr>
+            <w:r>
+              <w:rPr>
+                <w:rFonts w:ascii="微软雅黑" w:hAnsi="微软雅黑" w:eastAsia="微软雅黑"/>
+                <w:b w:val="0"/>
+                <w:sz w:val="19"/>
+              </w:rPr>
+              <w:t>把 webscan 移到 RSA 之后，十六进制改成 ⑨，现在是 ⓪①②③④⑤⑥⑦⑧⑨</w:t>
             </w:r>
           </w:p>
         </w:tc>

</xml_diff>